<commit_message>
Add ER diagram and SVG representation for the library system
- Created an SVG file for the identity relationship diagram of the library system, detailing entities such as Libro, Autor, Editorial, and Genero.
- Added an HTML file to render the ER diagram using Mermaid.js, including entities like USUARIO, CAJA, VENTA, and their relationships.
</commit_message>
<xml_diff>
--- a/Proyecto/docs/ADS_Tarea1Proyecto_JoshuaOsorio_AndresFabara.docx
+++ b/Proyecto/docs/ADS_Tarea1Proyecto_JoshuaOsorio_AndresFabara.docx
@@ -3536,126 +3536,216 @@
     </w:p>
     <w:p>
       <w:pPr>
-        <w:pStyle w:val="NormalWeb"/>
-        <w:rPr>
-          <w:rFonts w:ascii="Proxima Nova" w:hAnsi="Proxima Nova" w:cs="Arial"/>
-          <w:b/>
-          <w:bCs/>
-          <w:sz w:val="28"/>
-          <w:szCs w:val="28"/>
-          <w:lang w:val="es-MX"/>
-        </w:rPr>
-      </w:pPr>
-      <w:r>
-        <w:rPr>
-          <w:rFonts w:ascii="Proxima Nova" w:hAnsi="Proxima Nova" w:cs="Arial"/>
-          <w:b/>
-          <w:bCs/>
-          <w:sz w:val="28"/>
-          <w:szCs w:val="28"/>
-          <w:lang w:val="es-MX"/>
-        </w:rPr>
-        <w:t>Conclusión</w:t>
-      </w:r>
-    </w:p>
-    <w:p>
-      <w:pPr>
-        <w:jc w:val="both"/>
-        <w:rPr>
-          <w:rFonts w:ascii="Proxima Nova" w:hAnsi="Proxima Nova"/>
-          <w:sz w:val="24"/>
-          <w:szCs w:val="24"/>
-          <w:lang w:val="es-MX"/>
-        </w:rPr>
-      </w:pPr>
-      <w:r>
-        <w:rPr>
-          <w:rFonts w:ascii="Proxima Nova" w:hAnsi="Proxima Nova"/>
-          <w:sz w:val="24"/>
-          <w:szCs w:val="24"/>
-          <w:lang w:val="es-MX"/>
-        </w:rPr>
-        <w:t xml:space="preserve">El sistema POS tendrá como funcionalidades principales el registro de ventas, gestión de productos, generación de </w:t>
-      </w:r>
-      <w:proofErr w:type="gramStart"/>
-      <w:r>
-        <w:rPr>
-          <w:rFonts w:ascii="Proxima Nova" w:hAnsi="Proxima Nova"/>
-          <w:sz w:val="24"/>
-          <w:szCs w:val="24"/>
-          <w:lang w:val="es-MX"/>
-        </w:rPr>
-        <w:t>tickets</w:t>
-      </w:r>
-      <w:proofErr w:type="gramEnd"/>
-      <w:r>
-        <w:rPr>
-          <w:rFonts w:ascii="Proxima Nova" w:hAnsi="Proxima Nova"/>
-          <w:sz w:val="24"/>
-          <w:szCs w:val="24"/>
-          <w:lang w:val="es-MX"/>
-        </w:rPr>
-        <w:t>, control de inventario, consulta de reportes y autenticación de usuarios. Los usuarios del sistema son el cajero, que registra ventas; el administrador, que gestiona productos y reportes; el cliente, que recibe el comprobante; y la base de datos, que almacena la información.</w:t>
-      </w:r>
-    </w:p>
-    <w:p>
-      <w:pPr>
-        <w:jc w:val="both"/>
-        <w:rPr>
-          <w:rFonts w:ascii="Proxima Nova" w:hAnsi="Proxima Nova"/>
-          <w:sz w:val="24"/>
-          <w:szCs w:val="24"/>
-          <w:lang w:val="es-MX"/>
-        </w:rPr>
-      </w:pPr>
-      <w:r>
-        <w:rPr>
-          <w:rFonts w:ascii="Proxima Nova" w:hAnsi="Proxima Nova"/>
-          <w:sz w:val="24"/>
-          <w:szCs w:val="24"/>
-          <w:lang w:val="es-MX"/>
-        </w:rPr>
-        <w:t>El sistema realiza procesos internos como autenticación, cálculo automático de ventas, actualización del inventario, almacenamiento de datos y generación de reportes. Las actividades funcionales corresponden a las operaciones que el sistema ejecuta, mientras que las restricciones son las reglas y limitaciones que garantizan el correcto funcionamiento, como el uso de credenciales, el control de acceso y el uso obligatorio de una base de datos.</w:t>
-      </w:r>
-    </w:p>
-    <w:p>
-      <w:pPr>
         <w:pStyle w:val="Ttulo1"/>
-        <w:rPr>
-          <w:lang w:val="es-MX"/>
-        </w:rPr>
-      </w:pPr>
-      <w:r>
-        <w:rPr>
-          <w:lang w:val="es-MX"/>
-        </w:rPr>
-        <w:t>Diagrama De Secuencia.</w:t>
-      </w:r>
-    </w:p>
-    <w:p>
-      <w:pPr>
-        <w:rPr>
-          <w:lang w:val="es-MX"/>
-        </w:rPr>
-      </w:pPr>
+      </w:pPr>
+      <w:r>
+        <w:t>DIAGRAMAS DE CASO DE USO</w:t>
+      </w:r>
     </w:p>
     <w:p>
       <w:pPr>
         <w:pStyle w:val="Ttulo2"/>
-        <w:rPr>
-          <w:lang w:val="en-US"/>
-        </w:rPr>
-      </w:pPr>
-      <w:r>
-        <w:rPr>
-          <w:lang w:val="es-MX"/>
-        </w:rPr>
+        <w:tabs>
+          <w:tab w:val="left" w:pos="2745"/>
+        </w:tabs>
+      </w:pPr>
+      <w:r>
+        <w:t>Cajer</w:t>
+      </w:r>
+      <w:r>
+        <w:t>o</w:t>
+      </w:r>
+    </w:p>
+    <w:p>
+      <w:r>
+        <w:drawing>
+          <wp:inline distT="0" distB="0" distL="0" distR="0" wp14:anchorId="5741242D" wp14:editId="5BC13B00">
+            <wp:extent cx="5943600" cy="5958840"/>
+            <wp:effectExtent l="0" t="0" r="0" b="3810"/>
+            <wp:docPr id="1086500836" name="Imagen 1"/>
+            <wp:cNvGraphicFramePr>
+              <a:graphicFrameLocks xmlns:a="http://schemas.openxmlformats.org/drawingml/2006/main" noChangeAspect="1"/>
+            </wp:cNvGraphicFramePr>
+            <a:graphic xmlns:a="http://schemas.openxmlformats.org/drawingml/2006/main">
+              <a:graphicData uri="http://schemas.openxmlformats.org/drawingml/2006/picture">
+                <pic:pic xmlns:pic="http://schemas.openxmlformats.org/drawingml/2006/picture">
+                  <pic:nvPicPr>
+                    <pic:cNvPr id="1086500836" name=""/>
+                    <pic:cNvPicPr/>
+                  </pic:nvPicPr>
+                  <pic:blipFill>
+                    <a:blip r:embed="rId13"/>
+                    <a:stretch>
+                      <a:fillRect/>
+                    </a:stretch>
+                  </pic:blipFill>
+                  <pic:spPr>
+                    <a:xfrm>
+                      <a:off x="0" y="0"/>
+                      <a:ext cx="5943600" cy="5958840"/>
+                    </a:xfrm>
+                    <a:prstGeom prst="rect">
+                      <a:avLst/>
+                    </a:prstGeom>
+                  </pic:spPr>
+                </pic:pic>
+              </a:graphicData>
+            </a:graphic>
+          </wp:inline>
+        </w:drawing>
+      </w:r>
+    </w:p>
+    <w:p/>
+    <w:p>
+      <w:pPr>
+        <w:pStyle w:val="Ttulo2"/>
+        <w:tabs>
+          <w:tab w:val="left" w:pos="2745"/>
+        </w:tabs>
+      </w:pPr>
+      <w:r>
         <w:lastRenderedPageBreak/>
         <w:t>Administrador</w:t>
       </w:r>
-      <w:r>
-        <w:rPr>
-          <w:lang w:val="en-US"/>
+    </w:p>
+    <w:p>
+      <w:r>
+        <w:rPr>
+          <w:noProof/>
+        </w:rPr>
+        <w:drawing>
+          <wp:inline distT="0" distB="0" distL="0" distR="0" wp14:anchorId="4B673B7A" wp14:editId="142DE2D5">
+            <wp:extent cx="5943600" cy="6487160"/>
+            <wp:effectExtent l="0" t="0" r="0" b="8890"/>
+            <wp:docPr id="1089948939" name="Imagen 1"/>
+            <wp:cNvGraphicFramePr>
+              <a:graphicFrameLocks xmlns:a="http://schemas.openxmlformats.org/drawingml/2006/main" noChangeAspect="1"/>
+            </wp:cNvGraphicFramePr>
+            <a:graphic xmlns:a="http://schemas.openxmlformats.org/drawingml/2006/main">
+              <a:graphicData uri="http://schemas.openxmlformats.org/drawingml/2006/picture">
+                <pic:pic xmlns:pic="http://schemas.openxmlformats.org/drawingml/2006/picture">
+                  <pic:nvPicPr>
+                    <pic:cNvPr id="1089948939" name=""/>
+                    <pic:cNvPicPr/>
+                  </pic:nvPicPr>
+                  <pic:blipFill>
+                    <a:blip r:embed="rId14"/>
+                    <a:stretch>
+                      <a:fillRect/>
+                    </a:stretch>
+                  </pic:blipFill>
+                  <pic:spPr>
+                    <a:xfrm>
+                      <a:off x="0" y="0"/>
+                      <a:ext cx="5943600" cy="6487160"/>
+                    </a:xfrm>
+                    <a:prstGeom prst="rect">
+                      <a:avLst/>
+                    </a:prstGeom>
+                  </pic:spPr>
+                </pic:pic>
+              </a:graphicData>
+            </a:graphic>
+          </wp:inline>
+        </w:drawing>
+      </w:r>
+    </w:p>
+    <w:p>
+      <w:pPr>
+        <w:pStyle w:val="Ttulo2"/>
+      </w:pPr>
+      <w:r>
+        <w:lastRenderedPageBreak/>
+        <w:t>Cliente</w:t>
+      </w:r>
+    </w:p>
+    <w:p>
+      <w:r>
+        <w:rPr>
+          <w:noProof/>
+        </w:rPr>
+        <w:drawing>
+          <wp:inline distT="0" distB="0" distL="0" distR="0" wp14:anchorId="5D3E53B7" wp14:editId="2AE27577">
+            <wp:extent cx="5943600" cy="5763260"/>
+            <wp:effectExtent l="0" t="0" r="0" b="8890"/>
+            <wp:docPr id="1494342741" name="Imagen 1"/>
+            <wp:cNvGraphicFramePr>
+              <a:graphicFrameLocks xmlns:a="http://schemas.openxmlformats.org/drawingml/2006/main" noChangeAspect="1"/>
+            </wp:cNvGraphicFramePr>
+            <a:graphic xmlns:a="http://schemas.openxmlformats.org/drawingml/2006/main">
+              <a:graphicData uri="http://schemas.openxmlformats.org/drawingml/2006/picture">
+                <pic:pic xmlns:pic="http://schemas.openxmlformats.org/drawingml/2006/picture">
+                  <pic:nvPicPr>
+                    <pic:cNvPr id="1494342741" name=""/>
+                    <pic:cNvPicPr/>
+                  </pic:nvPicPr>
+                  <pic:blipFill>
+                    <a:blip r:embed="rId15"/>
+                    <a:stretch>
+                      <a:fillRect/>
+                    </a:stretch>
+                  </pic:blipFill>
+                  <pic:spPr>
+                    <a:xfrm>
+                      <a:off x="0" y="0"/>
+                      <a:ext cx="5943600" cy="5763260"/>
+                    </a:xfrm>
+                    <a:prstGeom prst="rect">
+                      <a:avLst/>
+                    </a:prstGeom>
+                  </pic:spPr>
+                </pic:pic>
+              </a:graphicData>
+            </a:graphic>
+          </wp:inline>
+        </w:drawing>
+      </w:r>
+      <w:r>
+        <w:rPr>
+          <w:noProof/>
+        </w:rPr>
+        <w:t xml:space="preserve"> </w:t>
+      </w:r>
+    </w:p>
+    <w:p/>
+    <w:p>
+      <w:pPr>
+        <w:pStyle w:val="Ttulo1"/>
+        <w:rPr>
+          <w:lang w:val="es-MX"/>
+        </w:rPr>
+      </w:pPr>
+      <w:r>
+        <w:rPr>
+          <w:lang w:val="es-MX"/>
+        </w:rPr>
+        <w:t>Diagrama De Secuencia.</w:t>
+      </w:r>
+    </w:p>
+    <w:p>
+      <w:pPr>
+        <w:rPr>
+          <w:lang w:val="es-MX"/>
+        </w:rPr>
+      </w:pPr>
+    </w:p>
+    <w:p>
+      <w:pPr>
+        <w:pStyle w:val="Ttulo2"/>
+        <w:rPr>
+          <w:lang w:val="es-MX"/>
+        </w:rPr>
+      </w:pPr>
+      <w:r>
+        <w:rPr>
+          <w:lang w:val="es-MX"/>
+        </w:rPr>
+        <w:lastRenderedPageBreak/>
+        <w:t>Administrador</w:t>
+      </w:r>
+      <w:r>
+        <w:rPr>
+          <w:lang w:val="es-MX"/>
         </w:rPr>
         <w:t>:</w:t>
       </w:r>
@@ -3664,23 +3754,23 @@
       <w:pPr>
         <w:pStyle w:val="Ttulo3"/>
         <w:rPr>
-          <w:lang w:val="en-US"/>
-        </w:rPr>
-      </w:pPr>
+          <w:lang w:val="es-MX"/>
+        </w:rPr>
+      </w:pPr>
+      <w:r>
+        <w:rPr>
+          <w:lang w:val="es-MX"/>
+        </w:rPr>
+        <w:t xml:space="preserve">Inicio de </w:t>
+      </w:r>
       <w:proofErr w:type="spellStart"/>
       <w:r>
         <w:rPr>
-          <w:lang w:val="en-US"/>
-        </w:rPr>
-        <w:t>Inicio</w:t>
+          <w:lang w:val="es-MX"/>
+        </w:rPr>
+        <w:t>session</w:t>
       </w:r>
       <w:proofErr w:type="spellEnd"/>
-      <w:r>
-        <w:rPr>
-          <w:lang w:val="en-US"/>
-        </w:rPr>
-        <w:t xml:space="preserve"> de session</w:t>
-      </w:r>
     </w:p>
     <w:p>
       <w:pPr>
@@ -3691,6 +3781,7 @@
       </w:pPr>
       <w:r>
         <w:rPr>
+          <w:noProof/>
           <w:u w:val="single"/>
           <w:lang w:val="en-US"/>
         </w:rPr>
@@ -3710,7 +3801,7 @@
                     <pic:cNvPicPr/>
                   </pic:nvPicPr>
                   <pic:blipFill>
-                    <a:blip r:embed="rId13"/>
+                    <a:blip r:embed="rId16"/>
                     <a:stretch>
                       <a:fillRect/>
                     </a:stretch>
@@ -3777,6 +3868,7 @@
       </w:pPr>
       <w:r>
         <w:rPr>
+          <w:noProof/>
           <w:lang w:val="es-MX"/>
         </w:rPr>
         <w:drawing>
@@ -3795,7 +3887,7 @@
                     <pic:cNvPicPr/>
                   </pic:nvPicPr>
                   <pic:blipFill>
-                    <a:blip r:embed="rId14"/>
+                    <a:blip r:embed="rId17"/>
                     <a:stretch>
                       <a:fillRect/>
                     </a:stretch>
@@ -3839,6 +3931,7 @@
       </w:pPr>
       <w:r>
         <w:rPr>
+          <w:noProof/>
           <w:lang w:val="es-MX"/>
         </w:rPr>
         <w:drawing>
@@ -3857,7 +3950,7 @@
                     <pic:cNvPicPr/>
                   </pic:nvPicPr>
                   <pic:blipFill>
-                    <a:blip r:embed="rId15"/>
+                    <a:blip r:embed="rId18"/>
                     <a:stretch>
                       <a:fillRect/>
                     </a:stretch>
@@ -3900,6 +3993,7 @@
       </w:pPr>
       <w:r>
         <w:rPr>
+          <w:noProof/>
           <w:lang w:val="es-MX"/>
         </w:rPr>
         <w:drawing>
@@ -3918,7 +4012,7 @@
                     <pic:cNvPicPr/>
                   </pic:nvPicPr>
                   <pic:blipFill>
-                    <a:blip r:embed="rId16"/>
+                    <a:blip r:embed="rId19"/>
                     <a:stretch>
                       <a:fillRect/>
                     </a:stretch>
@@ -3962,6 +4056,7 @@
       </w:pPr>
       <w:r>
         <w:rPr>
+          <w:noProof/>
           <w:lang w:val="es-MX"/>
         </w:rPr>
         <w:drawing>
@@ -3980,7 +4075,7 @@
                     <pic:cNvPicPr/>
                   </pic:nvPicPr>
                   <pic:blipFill>
-                    <a:blip r:embed="rId17"/>
+                    <a:blip r:embed="rId20"/>
                     <a:stretch>
                       <a:fillRect/>
                     </a:stretch>
@@ -4023,6 +4118,7 @@
       </w:pPr>
       <w:r>
         <w:rPr>
+          <w:noProof/>
           <w:lang w:val="es-MX"/>
         </w:rPr>
         <w:drawing>
@@ -4041,7 +4137,7 @@
                     <pic:cNvPicPr/>
                   </pic:nvPicPr>
                   <pic:blipFill>
-                    <a:blip r:embed="rId18"/>
+                    <a:blip r:embed="rId21"/>
                     <a:stretch>
                       <a:fillRect/>
                     </a:stretch>
@@ -4085,6 +4181,7 @@
       </w:pPr>
       <w:r>
         <w:rPr>
+          <w:noProof/>
           <w:lang w:val="es-MX"/>
         </w:rPr>
         <w:drawing>
@@ -4103,7 +4200,7 @@
                     <pic:cNvPicPr/>
                   </pic:nvPicPr>
                   <pic:blipFill>
-                    <a:blip r:embed="rId19"/>
+                    <a:blip r:embed="rId22"/>
                     <a:stretch>
                       <a:fillRect/>
                     </a:stretch>
@@ -4126,6 +4223,265 @@
     </w:p>
     <w:p>
       <w:pPr>
+        <w:pStyle w:val="Ttulo2"/>
+        <w:rPr>
+          <w:lang w:val="es-MX"/>
+        </w:rPr>
+      </w:pPr>
+      <w:r>
+        <w:rPr>
+          <w:lang w:val="es-MX"/>
+        </w:rPr>
+        <w:t>Cajero</w:t>
+      </w:r>
+    </w:p>
+    <w:p>
+      <w:pPr>
+        <w:pStyle w:val="Ttulo3"/>
+        <w:rPr>
+          <w:lang w:val="es-MX"/>
+        </w:rPr>
+      </w:pPr>
+      <w:r>
+        <w:rPr>
+          <w:lang w:val="es-MX"/>
+        </w:rPr>
+        <w:t xml:space="preserve">Iniciar </w:t>
+      </w:r>
+      <w:r>
+        <w:rPr>
+          <w:lang w:val="es-MX"/>
+        </w:rPr>
+        <w:t>sesión</w:t>
+      </w:r>
+    </w:p>
+    <w:p>
+      <w:pPr>
+        <w:pStyle w:val="Ttulo3"/>
+        <w:rPr>
+          <w:lang w:val="es-MX"/>
+        </w:rPr>
+      </w:pPr>
+      <w:r>
+        <w:rPr>
+          <w:lang w:val="es-MX"/>
+        </w:rPr>
+        <w:t>Registrar ventas</w:t>
+      </w:r>
+    </w:p>
+    <w:p>
+      <w:pPr>
+        <w:pStyle w:val="Ttulo3"/>
+        <w:rPr>
+          <w:lang w:val="es-MX"/>
+        </w:rPr>
+      </w:pPr>
+      <w:r>
+        <w:rPr>
+          <w:lang w:val="es-MX"/>
+        </w:rPr>
+        <w:t>Seleccionar Productos</w:t>
+      </w:r>
+    </w:p>
+    <w:p>
+      <w:pPr>
+        <w:pStyle w:val="Ttulo3"/>
+        <w:rPr>
+          <w:lang w:val="es-MX"/>
+        </w:rPr>
+      </w:pPr>
+      <w:r>
+        <w:rPr>
+          <w:lang w:val="es-MX"/>
+        </w:rPr>
+        <w:t>Consultar precios de producto</w:t>
+      </w:r>
+    </w:p>
+    <w:p>
+      <w:pPr>
+        <w:pStyle w:val="Ttulo3"/>
+        <w:rPr>
+          <w:lang w:val="es-MX"/>
+        </w:rPr>
+      </w:pPr>
+      <w:r>
+        <w:rPr>
+          <w:lang w:val="es-MX"/>
+        </w:rPr>
+        <w:t xml:space="preserve">Generar </w:t>
+      </w:r>
+      <w:proofErr w:type="gramStart"/>
+      <w:r>
+        <w:rPr>
+          <w:lang w:val="es-MX"/>
+        </w:rPr>
+        <w:t>tickets</w:t>
+      </w:r>
+      <w:proofErr w:type="gramEnd"/>
+    </w:p>
+    <w:p>
+      <w:pPr>
+        <w:pStyle w:val="Ttulo3"/>
+        <w:rPr>
+          <w:lang w:val="es-MX"/>
+        </w:rPr>
+      </w:pPr>
+      <w:r>
+        <w:rPr>
+          <w:lang w:val="es-MX"/>
+        </w:rPr>
+        <w:t>Finalizar trans</w:t>
+      </w:r>
+      <w:r>
+        <w:rPr>
+          <w:lang w:val="es-MX"/>
+        </w:rPr>
+        <w:t>acciones</w:t>
+      </w:r>
+    </w:p>
+    <w:p>
+      <w:pPr>
+        <w:rPr>
+          <w:lang w:val="es-MX"/>
+        </w:rPr>
+      </w:pPr>
+    </w:p>
+    <w:p>
+      <w:pPr>
+        <w:pStyle w:val="Ttulo2"/>
+        <w:rPr>
+          <w:lang w:val="es-MX"/>
+        </w:rPr>
+      </w:pPr>
+      <w:r>
+        <w:rPr>
+          <w:lang w:val="es-MX"/>
+        </w:rPr>
+        <w:lastRenderedPageBreak/>
+        <w:t>Cliente</w:t>
+      </w:r>
+    </w:p>
+    <w:p>
+      <w:pPr>
+        <w:pStyle w:val="Ttulo3"/>
+        <w:rPr>
+          <w:lang w:val="es-MX"/>
+        </w:rPr>
+      </w:pPr>
+      <w:r>
+        <w:rPr>
+          <w:lang w:val="es-MX"/>
+        </w:rPr>
+        <w:t>Solicitar la compra del producto</w:t>
+      </w:r>
+    </w:p>
+    <w:p>
+      <w:pPr>
+        <w:pStyle w:val="Ttulo3"/>
+        <w:rPr>
+          <w:lang w:val="es-MX"/>
+        </w:rPr>
+      </w:pPr>
+      <w:r>
+        <w:rPr>
+          <w:lang w:val="es-MX"/>
+        </w:rPr>
+        <w:t xml:space="preserve">Recibir </w:t>
+      </w:r>
+      <w:proofErr w:type="gramStart"/>
+      <w:r>
+        <w:rPr>
+          <w:lang w:val="es-MX"/>
+        </w:rPr>
+        <w:t>ticket</w:t>
+      </w:r>
+      <w:proofErr w:type="gramEnd"/>
+      <w:r>
+        <w:rPr>
+          <w:lang w:val="es-MX"/>
+        </w:rPr>
+        <w:t xml:space="preserve"> de compra</w:t>
+      </w:r>
+    </w:p>
+    <w:p>
+      <w:pPr>
+        <w:pStyle w:val="Ttulo3"/>
+        <w:rPr>
+          <w:lang w:val="es-MX"/>
+        </w:rPr>
+      </w:pPr>
+      <w:r>
+        <w:rPr>
+          <w:lang w:val="es-MX"/>
+        </w:rPr>
+        <w:t xml:space="preserve">Realizar </w:t>
+      </w:r>
+      <w:r>
+        <w:rPr>
+          <w:lang w:val="es-MX"/>
+        </w:rPr>
+        <w:t>el pago del producto</w:t>
+      </w:r>
+    </w:p>
+    <w:p>
+      <w:pPr>
+        <w:pStyle w:val="Ttulo3"/>
+        <w:rPr>
+          <w:lang w:val="es-MX"/>
+        </w:rPr>
+      </w:pPr>
+      <w:r>
+        <w:rPr>
+          <w:lang w:val="es-MX"/>
+        </w:rPr>
+        <w:t>Añadir productos al carrito</w:t>
+      </w:r>
+    </w:p>
+    <w:p>
+      <w:pPr>
+        <w:pStyle w:val="Ttulo3"/>
+        <w:rPr>
+          <w:lang w:val="es-MX"/>
+        </w:rPr>
+      </w:pPr>
+      <w:r>
+        <w:rPr>
+          <w:lang w:val="es-MX"/>
+        </w:rPr>
+        <w:t xml:space="preserve">Poder añadir </w:t>
+      </w:r>
+      <w:proofErr w:type="spellStart"/>
+      <w:r>
+        <w:rPr>
+          <w:lang w:val="es-MX"/>
+        </w:rPr>
+        <w:t>tips</w:t>
+      </w:r>
+      <w:proofErr w:type="spellEnd"/>
+      <w:r>
+        <w:rPr>
+          <w:lang w:val="es-MX"/>
+        </w:rPr>
+        <w:t xml:space="preserve"> al </w:t>
+      </w:r>
+      <w:proofErr w:type="gramStart"/>
+      <w:r>
+        <w:rPr>
+          <w:lang w:val="es-MX"/>
+        </w:rPr>
+        <w:t>ticket</w:t>
+      </w:r>
+      <w:proofErr w:type="gramEnd"/>
+    </w:p>
+    <w:p>
+      <w:pPr>
+        <w:rPr>
+          <w:lang w:val="es-MX"/>
+        </w:rPr>
+      </w:pPr>
+    </w:p>
+    <w:p>
+      <w:pPr>
         <w:rPr>
           <w:lang w:val="es-MX"/>
         </w:rPr>
@@ -4135,6 +4491,80 @@
           <w:lang w:val="es-MX"/>
         </w:rPr>
         <w:t xml:space="preserve"> </w:t>
+      </w:r>
+    </w:p>
+    <w:p>
+      <w:pPr>
+        <w:pStyle w:val="Ttulo1"/>
+        <w:rPr>
+          <w:lang w:val="es-MX"/>
+        </w:rPr>
+      </w:pPr>
+      <w:r>
+        <w:rPr>
+          <w:lang w:val="es-MX"/>
+        </w:rPr>
+        <w:t>Conclusión</w:t>
+      </w:r>
+    </w:p>
+    <w:p>
+      <w:pPr>
+        <w:jc w:val="both"/>
+        <w:rPr>
+          <w:rFonts w:ascii="Proxima Nova" w:hAnsi="Proxima Nova"/>
+          <w:sz w:val="24"/>
+          <w:szCs w:val="24"/>
+          <w:lang w:val="es-MX"/>
+        </w:rPr>
+      </w:pPr>
+      <w:r>
+        <w:rPr>
+          <w:rFonts w:ascii="Proxima Nova" w:hAnsi="Proxima Nova"/>
+          <w:sz w:val="24"/>
+          <w:szCs w:val="24"/>
+          <w:lang w:val="es-MX"/>
+        </w:rPr>
+        <w:t xml:space="preserve">El sistema POS tendrá como funcionalidades principales el registro de ventas, gestión de productos, generación de </w:t>
+      </w:r>
+      <w:proofErr w:type="gramStart"/>
+      <w:r>
+        <w:rPr>
+          <w:rFonts w:ascii="Proxima Nova" w:hAnsi="Proxima Nova"/>
+          <w:sz w:val="24"/>
+          <w:szCs w:val="24"/>
+          <w:lang w:val="es-MX"/>
+        </w:rPr>
+        <w:t>tickets</w:t>
+      </w:r>
+      <w:proofErr w:type="gramEnd"/>
+      <w:r>
+        <w:rPr>
+          <w:rFonts w:ascii="Proxima Nova" w:hAnsi="Proxima Nova"/>
+          <w:sz w:val="24"/>
+          <w:szCs w:val="24"/>
+          <w:lang w:val="es-MX"/>
+        </w:rPr>
+        <w:t>, control de inventario, consulta de reportes y autenticación de usuarios. Los usuarios del sistema son el cajero, que registra ventas; el administrador, que gestiona productos y reportes; el cliente, que recibe el comprobante; y la base de datos, que almacena la información.</w:t>
+      </w:r>
+    </w:p>
+    <w:p>
+      <w:pPr>
+        <w:jc w:val="both"/>
+        <w:rPr>
+          <w:rFonts w:ascii="Proxima Nova" w:hAnsi="Proxima Nova"/>
+          <w:sz w:val="24"/>
+          <w:szCs w:val="24"/>
+          <w:lang w:val="es-MX"/>
+        </w:rPr>
+      </w:pPr>
+      <w:r>
+        <w:rPr>
+          <w:rFonts w:ascii="Proxima Nova" w:hAnsi="Proxima Nova"/>
+          <w:sz w:val="24"/>
+          <w:szCs w:val="24"/>
+          <w:lang w:val="es-MX"/>
+        </w:rPr>
+        <w:t>El sistema realiza procesos internos como autenticación, cálculo automático de ventas, actualización del inventario, almacenamiento de datos y generación de reportes. Las actividades funcionales corresponden a las operaciones que el sistema ejecuta, mientras que las restricciones son las reglas y limitaciones que garantizan el correcto funcionamiento, como el uso de credenciales, el control de acceso y el uso obligatorio de una base de datos.</w:t>
       </w:r>
     </w:p>
     <w:p>

</xml_diff>

<commit_message>
Base de Datos y Consultas hechas
</commit_message>
<xml_diff>
--- a/Proyecto/docs/ADS_Tarea1Proyecto_JoshuaOsorio_AndresFabara.docx
+++ b/Proyecto/docs/ADS_Tarea1Proyecto_JoshuaOsorio_AndresFabara.docx
@@ -399,10 +399,12 @@
           <w:szCs w:val="30"/>
         </w:rPr>
         <w:sectPr>
-          <w:headerReference w:type="default" r:id="rId9"/>
-          <w:footerReference w:type="default" r:id="rId10"/>
-          <w:headerReference w:type="first" r:id="rId11"/>
-          <w:footerReference w:type="first" r:id="rId12"/>
+          <w:headerReference w:type="even" r:id="rId9"/>
+          <w:headerReference w:type="default" r:id="rId10"/>
+          <w:footerReference w:type="even" r:id="rId11"/>
+          <w:footerReference w:type="default" r:id="rId12"/>
+          <w:headerReference w:type="first" r:id="rId13"/>
+          <w:footerReference w:type="first" r:id="rId14"/>
           <w:pgSz w:w="12240" w:h="15840" w:code="1"/>
           <w:pgMar w:top="1440" w:right="1440" w:bottom="1440" w:left="1440" w:header="720" w:footer="720" w:gutter="0"/>
           <w:pgNumType w:start="1"/>
@@ -3558,6 +3560,9 @@
     </w:p>
     <w:p>
       <w:r>
+        <w:rPr>
+          <w:noProof/>
+        </w:rPr>
         <w:drawing>
           <wp:inline distT="0" distB="0" distL="0" distR="0" wp14:anchorId="5741242D" wp14:editId="5BC13B00">
             <wp:extent cx="5943600" cy="5958840"/>
@@ -3574,7 +3579,7 @@
                     <pic:cNvPicPr/>
                   </pic:nvPicPr>
                   <pic:blipFill>
-                    <a:blip r:embed="rId13"/>
+                    <a:blip r:embed="rId15"/>
                     <a:stretch>
                       <a:fillRect/>
                     </a:stretch>
@@ -3629,7 +3634,7 @@
                     <pic:cNvPicPr/>
                   </pic:nvPicPr>
                   <pic:blipFill>
-                    <a:blip r:embed="rId14"/>
+                    <a:blip r:embed="rId16"/>
                     <a:stretch>
                       <a:fillRect/>
                     </a:stretch>
@@ -3680,7 +3685,7 @@
                     <pic:cNvPicPr/>
                   </pic:nvPicPr>
                   <pic:blipFill>
-                    <a:blip r:embed="rId15"/>
+                    <a:blip r:embed="rId17"/>
                     <a:stretch>
                       <a:fillRect/>
                     </a:stretch>
@@ -3801,7 +3806,7 @@
                     <pic:cNvPicPr/>
                   </pic:nvPicPr>
                   <pic:blipFill>
-                    <a:blip r:embed="rId16"/>
+                    <a:blip r:embed="rId18"/>
                     <a:stretch>
                       <a:fillRect/>
                     </a:stretch>
@@ -3887,7 +3892,7 @@
                     <pic:cNvPicPr/>
                   </pic:nvPicPr>
                   <pic:blipFill>
-                    <a:blip r:embed="rId17"/>
+                    <a:blip r:embed="rId19"/>
                     <a:stretch>
                       <a:fillRect/>
                     </a:stretch>
@@ -3950,7 +3955,7 @@
                     <pic:cNvPicPr/>
                   </pic:nvPicPr>
                   <pic:blipFill>
-                    <a:blip r:embed="rId18"/>
+                    <a:blip r:embed="rId20"/>
                     <a:stretch>
                       <a:fillRect/>
                     </a:stretch>
@@ -4012,7 +4017,7 @@
                     <pic:cNvPicPr/>
                   </pic:nvPicPr>
                   <pic:blipFill>
-                    <a:blip r:embed="rId19"/>
+                    <a:blip r:embed="rId21"/>
                     <a:stretch>
                       <a:fillRect/>
                     </a:stretch>
@@ -4075,7 +4080,7 @@
                     <pic:cNvPicPr/>
                   </pic:nvPicPr>
                   <pic:blipFill>
-                    <a:blip r:embed="rId20"/>
+                    <a:blip r:embed="rId22"/>
                     <a:stretch>
                       <a:fillRect/>
                     </a:stretch>
@@ -4137,7 +4142,7 @@
                     <pic:cNvPicPr/>
                   </pic:nvPicPr>
                   <pic:blipFill>
-                    <a:blip r:embed="rId21"/>
+                    <a:blip r:embed="rId23"/>
                     <a:stretch>
                       <a:fillRect/>
                     </a:stretch>
@@ -4200,7 +4205,7 @@
                     <pic:cNvPicPr/>
                   </pic:nvPicPr>
                   <pic:blipFill>
-                    <a:blip r:embed="rId22"/>
+                    <a:blip r:embed="rId24"/>
                     <a:stretch>
                       <a:fillRect/>
                     </a:stretch>
@@ -4743,6 +4748,16 @@
 </file>
 
 <file path=word/footer1.xml><?xml version="1.0" encoding="utf-8"?>
+<w:ftr xmlns:wpc="http://schemas.microsoft.com/office/word/2010/wordprocessingCanvas" xmlns:cx="http://schemas.microsoft.com/office/drawing/2014/chartex" xmlns:cx1="http://schemas.microsoft.com/office/drawing/2015/9/8/chartex" xmlns:cx2="http://schemas.microsoft.com/office/drawing/2015/10/21/chartex" xmlns:cx3="http://schemas.microsoft.com/office/drawing/2016/5/9/chartex" xmlns:cx4="http://schemas.microsoft.com/office/drawing/2016/5/10/chartex" xmlns:cx5="http://schemas.microsoft.com/office/drawing/2016/5/11/chartex" xmlns:cx6="http://schemas.microsoft.com/office/drawing/2016/5/12/chartex" xmlns:cx7="http://schemas.microsoft.com/office/drawing/2016/5/13/chartex" xmlns:cx8="http://schemas.microsoft.com/office/drawing/2016/5/14/chartex" xmlns:mc="http://schemas.openxmlformats.org/markup-compatibility/2006" xmlns:aink="http://schemas.microsoft.com/office/drawing/2016/ink" xmlns:am3d="http://schemas.microsoft.com/office/drawing/2017/model3d" xmlns:o="urn:schemas-microsoft-com:office:office" xmlns:oel="http://schemas.microsoft.com/office/2019/extlst" xmlns:r="http://schemas.openxmlformats.org/officeDocument/2006/relationships" xmlns:m="http://schemas.openxmlformats.org/officeDocument/2006/math" xmlns:v="urn:schemas-microsoft-com:vml" xmlns:wp14="http://schemas.microsoft.com/office/word/2010/wordprocessingDrawing" xmlns:wp="http://schemas.openxmlformats.org/drawingml/2006/wordprocessingDrawing" xmlns:w10="urn:schemas-microsoft-com:office:word" xmlns:w="http://schemas.openxmlformats.org/wordprocessingml/2006/main" xmlns:w14="http://schemas.microsoft.com/office/word/2010/wordml" xmlns:w15="http://schemas.microsoft.com/office/word/2012/wordml" xmlns:w16cex="http://schemas.microsoft.com/office/word/2018/wordml/cex" xmlns:w16cid="http://schemas.microsoft.com/office/word/2016/wordml/cid" xmlns:w16="http://schemas.microsoft.com/office/word/2018/wordml" xmlns:w16du="http://schemas.microsoft.com/office/word/2023/wordml/word16du" xmlns:w16sdtdh="http://schemas.microsoft.com/office/word/2020/wordml/sdtdatahash" xmlns:w16sdtfl="http://schemas.microsoft.com/office/word/2024/wordml/sdtformatlock" xmlns:w16se="http://schemas.microsoft.com/office/word/2015/wordml/symex" xmlns:wpg="http://schemas.microsoft.com/office/word/2010/wordprocessingGroup" xmlns:wpi="http://schemas.microsoft.com/office/word/2010/wordprocessingInk" xmlns:wne="http://schemas.microsoft.com/office/word/2006/wordml" xmlns:wps="http://schemas.microsoft.com/office/word/2010/wordprocessingShape" mc:Ignorable="w14 w15 w16se w16cid w16 w16cex w16sdtdh w16sdtfl w16du wp14">
+  <w:p>
+    <w:pPr>
+      <w:pStyle w:val="Piedepgina"/>
+    </w:pPr>
+  </w:p>
+</w:ftr>
+</file>
+
+<file path=word/footer2.xml><?xml version="1.0" encoding="utf-8"?>
 <w:ftr xmlns:wpc="http://schemas.microsoft.com/office/word/2010/wordprocessingCanvas" xmlns:cx="http://schemas.microsoft.com/office/drawing/2014/chartex" xmlns:cx1="http://schemas.microsoft.com/office/drawing/2015/9/8/chartex" xmlns:cx2="http://schemas.microsoft.com/office/drawing/2015/10/21/chartex" xmlns:cx3="http://schemas.microsoft.com/office/drawing/2016/5/9/chartex" xmlns:cx4="http://schemas.microsoft.com/office/drawing/2016/5/10/chartex" xmlns:cx5="http://schemas.microsoft.com/office/drawing/2016/5/11/chartex" xmlns:cx6="http://schemas.microsoft.com/office/drawing/2016/5/12/chartex" xmlns:cx7="http://schemas.microsoft.com/office/drawing/2016/5/13/chartex" xmlns:cx8="http://schemas.microsoft.com/office/drawing/2016/5/14/chartex" xmlns:mc="http://schemas.openxmlformats.org/markup-compatibility/2006" xmlns:aink="http://schemas.microsoft.com/office/drawing/2016/ink" xmlns:am3d="http://schemas.microsoft.com/office/drawing/2017/model3d" xmlns:o="urn:schemas-microsoft-com:office:office" xmlns:oel="http://schemas.microsoft.com/office/2019/extlst" xmlns:r="http://schemas.openxmlformats.org/officeDocument/2006/relationships" xmlns:m="http://schemas.openxmlformats.org/officeDocument/2006/math" xmlns:v="urn:schemas-microsoft-com:vml" xmlns:wp14="http://schemas.microsoft.com/office/word/2010/wordprocessingDrawing" xmlns:wp="http://schemas.openxmlformats.org/drawingml/2006/wordprocessingDrawing" xmlns:w10="urn:schemas-microsoft-com:office:word" xmlns:w="http://schemas.openxmlformats.org/wordprocessingml/2006/main" xmlns:w14="http://schemas.microsoft.com/office/word/2010/wordml" xmlns:w15="http://schemas.microsoft.com/office/word/2012/wordml" xmlns:w16cex="http://schemas.microsoft.com/office/word/2018/wordml/cex" xmlns:w16cid="http://schemas.microsoft.com/office/word/2016/wordml/cid" xmlns:w16="http://schemas.microsoft.com/office/word/2018/wordml" xmlns:w16du="http://schemas.microsoft.com/office/word/2023/wordml/word16du" xmlns:w16sdtdh="http://schemas.microsoft.com/office/word/2020/wordml/sdtdatahash" xmlns:w16sdtfl="http://schemas.microsoft.com/office/word/2024/wordml/sdtformatlock" xmlns:w16se="http://schemas.microsoft.com/office/word/2015/wordml/symex" xmlns:wpg="http://schemas.microsoft.com/office/word/2010/wordprocessingGroup" xmlns:wpi="http://schemas.microsoft.com/office/word/2010/wordprocessingInk" xmlns:wne="http://schemas.microsoft.com/office/word/2006/wordml" xmlns:wps="http://schemas.microsoft.com/office/word/2010/wordprocessingShape" mc:Ignorable="w14 w15 w16se w16cid w16 w16cex w16sdtdh w16sdtfl w16du wp14">
   <w:p>
     <w:pPr>
@@ -4788,7 +4803,7 @@
 </w:ftr>
 </file>
 
-<file path=word/footer2.xml><?xml version="1.0" encoding="utf-8"?>
+<file path=word/footer3.xml><?xml version="1.0" encoding="utf-8"?>
 <w:ftr xmlns:wpc="http://schemas.microsoft.com/office/word/2010/wordprocessingCanvas" xmlns:cx="http://schemas.microsoft.com/office/drawing/2014/chartex" xmlns:cx1="http://schemas.microsoft.com/office/drawing/2015/9/8/chartex" xmlns:cx2="http://schemas.microsoft.com/office/drawing/2015/10/21/chartex" xmlns:cx3="http://schemas.microsoft.com/office/drawing/2016/5/9/chartex" xmlns:cx4="http://schemas.microsoft.com/office/drawing/2016/5/10/chartex" xmlns:cx5="http://schemas.microsoft.com/office/drawing/2016/5/11/chartex" xmlns:cx6="http://schemas.microsoft.com/office/drawing/2016/5/12/chartex" xmlns:cx7="http://schemas.microsoft.com/office/drawing/2016/5/13/chartex" xmlns:cx8="http://schemas.microsoft.com/office/drawing/2016/5/14/chartex" xmlns:mc="http://schemas.openxmlformats.org/markup-compatibility/2006" xmlns:aink="http://schemas.microsoft.com/office/drawing/2016/ink" xmlns:am3d="http://schemas.microsoft.com/office/drawing/2017/model3d" xmlns:o="urn:schemas-microsoft-com:office:office" xmlns:oel="http://schemas.microsoft.com/office/2019/extlst" xmlns:r="http://schemas.openxmlformats.org/officeDocument/2006/relationships" xmlns:m="http://schemas.openxmlformats.org/officeDocument/2006/math" xmlns:v="urn:schemas-microsoft-com:vml" xmlns:wp14="http://schemas.microsoft.com/office/word/2010/wordprocessingDrawing" xmlns:wp="http://schemas.openxmlformats.org/drawingml/2006/wordprocessingDrawing" xmlns:w10="urn:schemas-microsoft-com:office:word" xmlns:w="http://schemas.openxmlformats.org/wordprocessingml/2006/main" xmlns:w14="http://schemas.microsoft.com/office/word/2010/wordml" xmlns:w15="http://schemas.microsoft.com/office/word/2012/wordml" xmlns:w16cex="http://schemas.microsoft.com/office/word/2018/wordml/cex" xmlns:w16cid="http://schemas.microsoft.com/office/word/2016/wordml/cid" xmlns:w16="http://schemas.microsoft.com/office/word/2018/wordml" xmlns:w16du="http://schemas.microsoft.com/office/word/2023/wordml/word16du" xmlns:w16sdtdh="http://schemas.microsoft.com/office/word/2020/wordml/sdtdatahash" xmlns:w16sdtfl="http://schemas.microsoft.com/office/word/2024/wordml/sdtformatlock" xmlns:w16se="http://schemas.microsoft.com/office/word/2015/wordml/symex" xmlns:wpg="http://schemas.microsoft.com/office/word/2010/wordprocessingGroup" xmlns:wpi="http://schemas.microsoft.com/office/word/2010/wordprocessingInk" xmlns:wne="http://schemas.microsoft.com/office/word/2006/wordml" xmlns:wps="http://schemas.microsoft.com/office/word/2010/wordprocessingShape" mc:Ignorable="w14 w15 w16se w16cid w16 w16cex w16sdtdh w16sdtfl w16du wp14">
   <w:p>
     <w:pPr>
@@ -4871,6 +4886,16 @@
 <w:hdr xmlns:wpc="http://schemas.microsoft.com/office/word/2010/wordprocessingCanvas" xmlns:cx="http://schemas.microsoft.com/office/drawing/2014/chartex" xmlns:cx1="http://schemas.microsoft.com/office/drawing/2015/9/8/chartex" xmlns:cx2="http://schemas.microsoft.com/office/drawing/2015/10/21/chartex" xmlns:cx3="http://schemas.microsoft.com/office/drawing/2016/5/9/chartex" xmlns:cx4="http://schemas.microsoft.com/office/drawing/2016/5/10/chartex" xmlns:cx5="http://schemas.microsoft.com/office/drawing/2016/5/11/chartex" xmlns:cx6="http://schemas.microsoft.com/office/drawing/2016/5/12/chartex" xmlns:cx7="http://schemas.microsoft.com/office/drawing/2016/5/13/chartex" xmlns:cx8="http://schemas.microsoft.com/office/drawing/2016/5/14/chartex" xmlns:mc="http://schemas.openxmlformats.org/markup-compatibility/2006" xmlns:aink="http://schemas.microsoft.com/office/drawing/2016/ink" xmlns:am3d="http://schemas.microsoft.com/office/drawing/2017/model3d" xmlns:o="urn:schemas-microsoft-com:office:office" xmlns:oel="http://schemas.microsoft.com/office/2019/extlst" xmlns:r="http://schemas.openxmlformats.org/officeDocument/2006/relationships" xmlns:m="http://schemas.openxmlformats.org/officeDocument/2006/math" xmlns:v="urn:schemas-microsoft-com:vml" xmlns:wp14="http://schemas.microsoft.com/office/word/2010/wordprocessingDrawing" xmlns:wp="http://schemas.openxmlformats.org/drawingml/2006/wordprocessingDrawing" xmlns:w10="urn:schemas-microsoft-com:office:word" xmlns:w="http://schemas.openxmlformats.org/wordprocessingml/2006/main" xmlns:w14="http://schemas.microsoft.com/office/word/2010/wordml" xmlns:w15="http://schemas.microsoft.com/office/word/2012/wordml" xmlns:w16cex="http://schemas.microsoft.com/office/word/2018/wordml/cex" xmlns:w16cid="http://schemas.microsoft.com/office/word/2016/wordml/cid" xmlns:w16="http://schemas.microsoft.com/office/word/2018/wordml" xmlns:w16du="http://schemas.microsoft.com/office/word/2023/wordml/word16du" xmlns:w16sdtdh="http://schemas.microsoft.com/office/word/2020/wordml/sdtdatahash" xmlns:w16sdtfl="http://schemas.microsoft.com/office/word/2024/wordml/sdtformatlock" xmlns:w16se="http://schemas.microsoft.com/office/word/2015/wordml/symex" xmlns:wpg="http://schemas.microsoft.com/office/word/2010/wordprocessingGroup" xmlns:wpi="http://schemas.microsoft.com/office/word/2010/wordprocessingInk" xmlns:wne="http://schemas.microsoft.com/office/word/2006/wordml" xmlns:wps="http://schemas.microsoft.com/office/word/2010/wordprocessingShape" mc:Ignorable="w14 w15 w16se w16cid w16 w16cex w16sdtdh w16sdtfl w16du wp14">
   <w:p>
     <w:pPr>
+      <w:pStyle w:val="Encabezado"/>
+    </w:pPr>
+  </w:p>
+</w:hdr>
+</file>
+
+<file path=word/header2.xml><?xml version="1.0" encoding="utf-8"?>
+<w:hdr xmlns:wpc="http://schemas.microsoft.com/office/word/2010/wordprocessingCanvas" xmlns:cx="http://schemas.microsoft.com/office/drawing/2014/chartex" xmlns:cx1="http://schemas.microsoft.com/office/drawing/2015/9/8/chartex" xmlns:cx2="http://schemas.microsoft.com/office/drawing/2015/10/21/chartex" xmlns:cx3="http://schemas.microsoft.com/office/drawing/2016/5/9/chartex" xmlns:cx4="http://schemas.microsoft.com/office/drawing/2016/5/10/chartex" xmlns:cx5="http://schemas.microsoft.com/office/drawing/2016/5/11/chartex" xmlns:cx6="http://schemas.microsoft.com/office/drawing/2016/5/12/chartex" xmlns:cx7="http://schemas.microsoft.com/office/drawing/2016/5/13/chartex" xmlns:cx8="http://schemas.microsoft.com/office/drawing/2016/5/14/chartex" xmlns:mc="http://schemas.openxmlformats.org/markup-compatibility/2006" xmlns:aink="http://schemas.microsoft.com/office/drawing/2016/ink" xmlns:am3d="http://schemas.microsoft.com/office/drawing/2017/model3d" xmlns:o="urn:schemas-microsoft-com:office:office" xmlns:oel="http://schemas.microsoft.com/office/2019/extlst" xmlns:r="http://schemas.openxmlformats.org/officeDocument/2006/relationships" xmlns:m="http://schemas.openxmlformats.org/officeDocument/2006/math" xmlns:v="urn:schemas-microsoft-com:vml" xmlns:wp14="http://schemas.microsoft.com/office/word/2010/wordprocessingDrawing" xmlns:wp="http://schemas.openxmlformats.org/drawingml/2006/wordprocessingDrawing" xmlns:w10="urn:schemas-microsoft-com:office:word" xmlns:w="http://schemas.openxmlformats.org/wordprocessingml/2006/main" xmlns:w14="http://schemas.microsoft.com/office/word/2010/wordml" xmlns:w15="http://schemas.microsoft.com/office/word/2012/wordml" xmlns:w16cex="http://schemas.microsoft.com/office/word/2018/wordml/cex" xmlns:w16cid="http://schemas.microsoft.com/office/word/2016/wordml/cid" xmlns:w16="http://schemas.microsoft.com/office/word/2018/wordml" xmlns:w16du="http://schemas.microsoft.com/office/word/2023/wordml/word16du" xmlns:w16sdtdh="http://schemas.microsoft.com/office/word/2020/wordml/sdtdatahash" xmlns:w16sdtfl="http://schemas.microsoft.com/office/word/2024/wordml/sdtformatlock" xmlns:w16se="http://schemas.microsoft.com/office/word/2015/wordml/symex" xmlns:wpg="http://schemas.microsoft.com/office/word/2010/wordprocessingGroup" xmlns:wpi="http://schemas.microsoft.com/office/word/2010/wordprocessingInk" xmlns:wne="http://schemas.microsoft.com/office/word/2006/wordml" xmlns:wps="http://schemas.microsoft.com/office/word/2010/wordprocessingShape" mc:Ignorable="w14 w15 w16se w16cid w16 w16cex w16sdtdh w16sdtfl w16du wp14">
+  <w:p>
+    <w:pPr>
       <w:spacing w:before="240" w:after="240"/>
       <w:ind w:right="360"/>
       <w:jc w:val="center"/>
@@ -4932,7 +4957,7 @@
 </w:hdr>
 </file>
 
-<file path=word/header2.xml><?xml version="1.0" encoding="utf-8"?>
+<file path=word/header3.xml><?xml version="1.0" encoding="utf-8"?>
 <w:hdr xmlns:wpc="http://schemas.microsoft.com/office/word/2010/wordprocessingCanvas" xmlns:cx="http://schemas.microsoft.com/office/drawing/2014/chartex" xmlns:cx1="http://schemas.microsoft.com/office/drawing/2015/9/8/chartex" xmlns:cx2="http://schemas.microsoft.com/office/drawing/2015/10/21/chartex" xmlns:cx3="http://schemas.microsoft.com/office/drawing/2016/5/9/chartex" xmlns:cx4="http://schemas.microsoft.com/office/drawing/2016/5/10/chartex" xmlns:cx5="http://schemas.microsoft.com/office/drawing/2016/5/11/chartex" xmlns:cx6="http://schemas.microsoft.com/office/drawing/2016/5/12/chartex" xmlns:cx7="http://schemas.microsoft.com/office/drawing/2016/5/13/chartex" xmlns:cx8="http://schemas.microsoft.com/office/drawing/2016/5/14/chartex" xmlns:mc="http://schemas.openxmlformats.org/markup-compatibility/2006" xmlns:aink="http://schemas.microsoft.com/office/drawing/2016/ink" xmlns:am3d="http://schemas.microsoft.com/office/drawing/2017/model3d" xmlns:o="urn:schemas-microsoft-com:office:office" xmlns:oel="http://schemas.microsoft.com/office/2019/extlst" xmlns:r="http://schemas.openxmlformats.org/officeDocument/2006/relationships" xmlns:m="http://schemas.openxmlformats.org/officeDocument/2006/math" xmlns:v="urn:schemas-microsoft-com:vml" xmlns:wp14="http://schemas.microsoft.com/office/word/2010/wordprocessingDrawing" xmlns:wp="http://schemas.openxmlformats.org/drawingml/2006/wordprocessingDrawing" xmlns:w10="urn:schemas-microsoft-com:office:word" xmlns:w="http://schemas.openxmlformats.org/wordprocessingml/2006/main" xmlns:w14="http://schemas.microsoft.com/office/word/2010/wordml" xmlns:w15="http://schemas.microsoft.com/office/word/2012/wordml" xmlns:w16cex="http://schemas.microsoft.com/office/word/2018/wordml/cex" xmlns:w16cid="http://schemas.microsoft.com/office/word/2016/wordml/cid" xmlns:w16="http://schemas.microsoft.com/office/word/2018/wordml" xmlns:w16du="http://schemas.microsoft.com/office/word/2023/wordml/word16du" xmlns:w16sdtdh="http://schemas.microsoft.com/office/word/2020/wordml/sdtdatahash" xmlns:w16sdtfl="http://schemas.microsoft.com/office/word/2024/wordml/sdtformatlock" xmlns:w16se="http://schemas.microsoft.com/office/word/2015/wordml/symex" xmlns:wpg="http://schemas.microsoft.com/office/word/2010/wordprocessingGroup" xmlns:wpi="http://schemas.microsoft.com/office/word/2010/wordprocessingInk" xmlns:wne="http://schemas.microsoft.com/office/word/2006/wordml" xmlns:wps="http://schemas.microsoft.com/office/word/2010/wordprocessingShape" mc:Ignorable="w14 w15 w16se w16cid w16 w16cex w16sdtdh w16sdtfl w16du wp14">
   <w:p>
     <w:pPr>

</xml_diff>